<commit_message>
v2: True OOXML grid parsing with GridCell, next-row priority for teaching_process/method, grid-based cell write, reflection from 课后小记, strict cell-level validation tests
</commit_message>
<xml_diff>
--- a/tests/fixtures/教案模板.docx
+++ b/tests/fixtures/教案模板.docx
@@ -48,10 +48,11 @@
             <w:r>
               <w:rPr>
                 <w:rFonts w:ascii="SimSun" w:hAnsi="SimSun"/>
-                <w:b w:val="0"/>
+                <w:b/>
                 <w:sz w:val="18"/>
                 <w:rFonts w:eastAsia="SimSun"/>
               </w:rPr>
+              <w:t>授课班级</w:t>
             </w:r>
           </w:p>
         </w:tc>
@@ -134,53 +135,11 @@
             <w:r>
               <w:rPr>
                 <w:rFonts w:ascii="SimSun" w:hAnsi="SimSun"/>
-                <w:b w:val="0"/>
-                <w:sz w:val="18"/>
-                <w:rFonts w:eastAsia="SimSun"/>
-              </w:rPr>
-            </w:r>
-          </w:p>
-        </w:tc>
-      </w:tr>
-      <w:tr>
-        <w:tc>
-          <w:tcPr>
-            <w:tcW w:type="dxa" w:w="4819"/>
-            <w:vAlign w:val="center"/>
-          </w:tcPr>
-          <w:p>
-            <w:pPr>
-              <w:jc w:val="center"/>
-            </w:pPr>
-            <w:r/>
-            <w:r>
-              <w:rPr>
-                <w:rFonts w:ascii="SimSun" w:hAnsi="SimSun"/>
                 <w:b/>
                 <w:sz w:val="18"/>
                 <w:rFonts w:eastAsia="SimSun"/>
               </w:rPr>
               <w:t>课时数</w:t>
-            </w:r>
-          </w:p>
-        </w:tc>
-        <w:tc>
-          <w:tcPr>
-            <w:tcW w:type="dxa" w:w="4819"/>
-            <w:vAlign w:val="center"/>
-          </w:tcPr>
-          <w:p>
-            <w:pPr>
-              <w:jc w:val="center"/>
-            </w:pPr>
-            <w:r/>
-            <w:r>
-              <w:rPr>
-                <w:rFonts w:ascii="SimSun" w:hAnsi="SimSun"/>
-                <w:b w:val="0"/>
-                <w:sz w:val="18"/>
-                <w:rFonts w:eastAsia="SimSun"/>
-              </w:rPr>
             </w:r>
           </w:p>
         </w:tc>
@@ -486,6 +445,63 @@
           </w:p>
         </w:tc>
       </w:tr>
+      <w:tr>
+        <w:tc>
+          <w:tcPr>
+            <w:tcW w:type="dxa" w:w="4819"/>
+            <w:vAlign w:val="center"/>
+          </w:tcPr>
+          <w:p>
+            <w:pPr>
+              <w:jc w:val="center"/>
+            </w:pPr>
+            <w:r/>
+            <w:r>
+              <w:rPr>
+                <w:rFonts w:ascii="SimSun" w:hAnsi="SimSun"/>
+                <w:b/>
+                <w:sz w:val="18"/>
+                <w:rFonts w:eastAsia="SimSun"/>
+              </w:rPr>
+              <w:t>课后小记</w:t>
+            </w:r>
+          </w:p>
+        </w:tc>
+        <w:tc>
+          <w:tcPr>
+            <w:tcW w:type="dxa" w:w="4819"/>
+            <w:vAlign w:val="center"/>
+          </w:tcPr>
+          <w:p>
+            <w:pPr>
+              <w:jc w:val="center"/>
+            </w:pPr>
+            <w:r/>
+            <w:r>
+              <w:rPr>
+                <w:rFonts w:ascii="SimSun" w:hAnsi="SimSun"/>
+                <w:b w:val="0"/>
+                <w:sz w:val="18"/>
+                <w:rFonts w:eastAsia="SimSun"/>
+              </w:rPr>
+            </w:r>
+          </w:p>
+        </w:tc>
+      </w:tr>
+      <w:tr>
+        <w:tc>
+          <w:tcPr>
+            <w:tcW w:type="dxa" w:w="4819"/>
+          </w:tcPr>
+          <w:p/>
+        </w:tc>
+        <w:tc>
+          <w:tcPr>
+            <w:tcW w:type="dxa" w:w="4819"/>
+          </w:tcPr>
+          <w:p/>
+        </w:tc>
+      </w:tr>
     </w:tbl>
     <w:p/>
     <w:tbl>
@@ -534,10 +550,11 @@
             <w:r>
               <w:rPr>
                 <w:rFonts w:ascii="SimSun" w:hAnsi="SimSun"/>
-                <w:b w:val="0"/>
+                <w:b/>
                 <w:sz w:val="18"/>
                 <w:rFonts w:eastAsia="SimSun"/>
               </w:rPr>
+              <w:t>授课班级</w:t>
             </w:r>
           </w:p>
         </w:tc>
@@ -620,53 +637,11 @@
             <w:r>
               <w:rPr>
                 <w:rFonts w:ascii="SimSun" w:hAnsi="SimSun"/>
-                <w:b w:val="0"/>
-                <w:sz w:val="18"/>
-                <w:rFonts w:eastAsia="SimSun"/>
-              </w:rPr>
-            </w:r>
-          </w:p>
-        </w:tc>
-      </w:tr>
-      <w:tr>
-        <w:tc>
-          <w:tcPr>
-            <w:tcW w:type="dxa" w:w="4819"/>
-            <w:vAlign w:val="center"/>
-          </w:tcPr>
-          <w:p>
-            <w:pPr>
-              <w:jc w:val="center"/>
-            </w:pPr>
-            <w:r/>
-            <w:r>
-              <w:rPr>
-                <w:rFonts w:ascii="SimSun" w:hAnsi="SimSun"/>
                 <w:b/>
                 <w:sz w:val="18"/>
                 <w:rFonts w:eastAsia="SimSun"/>
               </w:rPr>
               <w:t>课时数</w:t>
-            </w:r>
-          </w:p>
-        </w:tc>
-        <w:tc>
-          <w:tcPr>
-            <w:tcW w:type="dxa" w:w="4819"/>
-            <w:vAlign w:val="center"/>
-          </w:tcPr>
-          <w:p>
-            <w:pPr>
-              <w:jc w:val="center"/>
-            </w:pPr>
-            <w:r/>
-            <w:r>
-              <w:rPr>
-                <w:rFonts w:ascii="SimSun" w:hAnsi="SimSun"/>
-                <w:b w:val="0"/>
-                <w:sz w:val="18"/>
-                <w:rFonts w:eastAsia="SimSun"/>
-              </w:rPr>
             </w:r>
           </w:p>
         </w:tc>
@@ -970,6 +945,63 @@
               </w:rPr>
             </w:r>
           </w:p>
+        </w:tc>
+      </w:tr>
+      <w:tr>
+        <w:tc>
+          <w:tcPr>
+            <w:tcW w:type="dxa" w:w="4819"/>
+            <w:vAlign w:val="center"/>
+          </w:tcPr>
+          <w:p>
+            <w:pPr>
+              <w:jc w:val="center"/>
+            </w:pPr>
+            <w:r/>
+            <w:r>
+              <w:rPr>
+                <w:rFonts w:ascii="SimSun" w:hAnsi="SimSun"/>
+                <w:b/>
+                <w:sz w:val="18"/>
+                <w:rFonts w:eastAsia="SimSun"/>
+              </w:rPr>
+              <w:t>课后小记</w:t>
+            </w:r>
+          </w:p>
+        </w:tc>
+        <w:tc>
+          <w:tcPr>
+            <w:tcW w:type="dxa" w:w="4819"/>
+            <w:vAlign w:val="center"/>
+          </w:tcPr>
+          <w:p>
+            <w:pPr>
+              <w:jc w:val="center"/>
+            </w:pPr>
+            <w:r/>
+            <w:r>
+              <w:rPr>
+                <w:rFonts w:ascii="SimSun" w:hAnsi="SimSun"/>
+                <w:b w:val="0"/>
+                <w:sz w:val="18"/>
+                <w:rFonts w:eastAsia="SimSun"/>
+              </w:rPr>
+            </w:r>
+          </w:p>
+        </w:tc>
+      </w:tr>
+      <w:tr>
+        <w:tc>
+          <w:tcPr>
+            <w:tcW w:type="dxa" w:w="4819"/>
+          </w:tcPr>
+          <w:p/>
+        </w:tc>
+        <w:tc>
+          <w:tcPr>
+            <w:tcW w:type="dxa" w:w="4819"/>
+          </w:tcPr>
+          <w:p/>
         </w:tc>
       </w:tr>
     </w:tbl>

</xml_diff>